<commit_message>
modify aplicacion de las normas apa, se bajo la bibliografia y se modifico algunos conceptos
</commit_message>
<xml_diff>
--- a/minuta2.docx
+++ b/minuta2.docx
@@ -287,7 +287,7 @@
     </w:p>
     <w:p>
       <w:pPr>
-        <w:pStyle w:val="Prrafodelista"/>
+        <w:pStyle w:val="ListParagraph"/>
         <w:numPr>
           <w:ilvl w:val="0"/>
           <w:numId w:val="6"/>
@@ -313,17 +313,17 @@
       <w:r>
         <w:rPr>
           <w:rFonts w:ascii="Arial" w:hAnsi="Arial" w:cs="Arial"/>
-          <w:bCs/>
-          <w:color w:val="FF0000"/>
-          <w:sz w:val="24"/>
-          <w:szCs w:val="24"/>
-        </w:rPr>
-        <w:t>Indicar el nombre</w:t>
-      </w:r>
-    </w:p>
-    <w:p>
-      <w:pPr>
-        <w:pStyle w:val="Prrafodelista"/>
+          <w:b/>
+          <w:color w:val="404040" w:themeColor="text1" w:themeTint="BF"/>
+          <w:sz w:val="24"/>
+          <w:szCs w:val="24"/>
+        </w:rPr>
+        <w:t>Equipo 7</w:t>
+      </w:r>
+    </w:p>
+    <w:p>
+      <w:pPr>
+        <w:pStyle w:val="ListParagraph"/>
         <w:numPr>
           <w:ilvl w:val="0"/>
           <w:numId w:val="6"/>
@@ -364,23 +364,58 @@
           <w:color w:val="404040" w:themeColor="text1" w:themeTint="BF"/>
           <w:sz w:val="24"/>
           <w:szCs w:val="24"/>
+          <w:u w:val="single"/>
         </w:rPr>
         <w:t xml:space="preserve">: </w:t>
       </w:r>
+      <w:proofErr w:type="spellStart"/>
       <w:r>
         <w:rPr>
           <w:rFonts w:ascii="Arial" w:hAnsi="Arial" w:cs="Arial"/>
           <w:bCs/>
-          <w:color w:val="FF0000"/>
-          <w:sz w:val="24"/>
-          <w:szCs w:val="24"/>
-        </w:rPr>
-        <w:t>Indicar el nombre completo de miembros activos en el grupo actualmente (separados por comas)</w:t>
-      </w:r>
-    </w:p>
-    <w:p>
-      <w:pPr>
-        <w:pStyle w:val="Prrafodelista"/>
+          <w:color w:val="404040" w:themeColor="text1" w:themeTint="BF"/>
+          <w:sz w:val="24"/>
+          <w:szCs w:val="24"/>
+        </w:rPr>
+        <w:t>Caludia</w:t>
+      </w:r>
+      <w:proofErr w:type="spellEnd"/>
+      <w:r>
+        <w:rPr>
+          <w:rFonts w:ascii="Arial" w:hAnsi="Arial" w:cs="Arial"/>
+          <w:bCs/>
+          <w:color w:val="404040" w:themeColor="text1" w:themeTint="BF"/>
+          <w:sz w:val="24"/>
+          <w:szCs w:val="24"/>
+        </w:rPr>
+        <w:t xml:space="preserve"> Andrea Morales Urribarri, Jimmy Estir Vergara </w:t>
+      </w:r>
+      <w:proofErr w:type="gramStart"/>
+      <w:r>
+        <w:rPr>
+          <w:rFonts w:ascii="Arial" w:hAnsi="Arial" w:cs="Arial"/>
+          <w:bCs/>
+          <w:color w:val="404040" w:themeColor="text1" w:themeTint="BF"/>
+          <w:sz w:val="24"/>
+          <w:szCs w:val="24"/>
+        </w:rPr>
+        <w:t>Coronel</w:t>
+      </w:r>
+      <w:proofErr w:type="gramEnd"/>
+      <w:r>
+        <w:rPr>
+          <w:rFonts w:ascii="Arial" w:hAnsi="Arial" w:cs="Arial"/>
+          <w:bCs/>
+          <w:color w:val="404040" w:themeColor="text1" w:themeTint="BF"/>
+          <w:sz w:val="24"/>
+          <w:szCs w:val="24"/>
+        </w:rPr>
+        <w:t>, Kenny Torres Belisario.</w:t>
+      </w:r>
+    </w:p>
+    <w:p>
+      <w:pPr>
+        <w:pStyle w:val="ListParagraph"/>
         <w:numPr>
           <w:ilvl w:val="0"/>
           <w:numId w:val="6"/>
@@ -417,11 +452,11 @@
         <w:rPr>
           <w:rFonts w:ascii="Arial" w:hAnsi="Arial" w:cs="Arial"/>
           <w:bCs/>
-          <w:color w:val="FF0000"/>
-          <w:sz w:val="24"/>
-          <w:szCs w:val="24"/>
-        </w:rPr>
-        <w:t>Indicar el número del entregable</w:t>
+          <w:color w:val="404040" w:themeColor="text1" w:themeTint="BF"/>
+          <w:sz w:val="24"/>
+          <w:szCs w:val="24"/>
+        </w:rPr>
+        <w:t>Entregable 2</w:t>
       </w:r>
     </w:p>
     <w:p>
@@ -1144,6 +1179,51 @@
           <w:szCs w:val="24"/>
           <w:lang w:eastAsia="es-ES"/>
         </w:rPr>
+        <w:t xml:space="preserve">Stock For </w:t>
+      </w:r>
+      <w:proofErr w:type="spellStart"/>
+      <w:r>
+        <w:rPr>
+          <w:rFonts w:ascii="var(--font-family-headings)" w:eastAsia="Times New Roman" w:hAnsi="var(--font-family-headings)" w:cs="Times New Roman"/>
+          <w:b/>
+          <w:bCs/>
+          <w:color w:val="000000"/>
+          <w:spacing w:val="-2"/>
+          <w:sz w:val="24"/>
+          <w:szCs w:val="24"/>
+          <w:lang w:eastAsia="es-ES"/>
+        </w:rPr>
+        <w:t>PYMEs</w:t>
+      </w:r>
+      <w:proofErr w:type="spellEnd"/>
+    </w:p>
+    <w:p>
+      <w:pPr>
+        <w:shd w:val="clear" w:color="auto" w:fill="FFFFFF"/>
+        <w:spacing w:before="100" w:beforeAutospacing="1" w:after="100" w:afterAutospacing="1" w:line="240" w:lineRule="auto"/>
+        <w:outlineLvl w:val="3"/>
+        <w:rPr>
+          <w:rFonts w:ascii="var(--font-family-headings)" w:eastAsia="Times New Roman" w:hAnsi="var(--font-family-headings)" w:cs="Times New Roman"/>
+          <w:b/>
+          <w:bCs/>
+          <w:color w:val="000000"/>
+          <w:spacing w:val="-2"/>
+          <w:sz w:val="24"/>
+          <w:szCs w:val="24"/>
+          <w:lang w:eastAsia="es-ES"/>
+        </w:rPr>
+      </w:pPr>
+      <w:r>
+        <w:rPr>
+          <w:rFonts w:ascii="var(--font-family-headings)" w:eastAsia="Times New Roman" w:hAnsi="var(--font-family-headings)" w:cs="Times New Roman"/>
+          <w:b/>
+          <w:bCs/>
+          <w:color w:val="000000"/>
+          <w:spacing w:val="-2"/>
+          <w:sz w:val="24"/>
+          <w:szCs w:val="24"/>
+          <w:lang w:eastAsia="es-ES"/>
+        </w:rPr>
         <w:t>2. Visión del Proyecto</w:t>
       </w:r>
     </w:p>
@@ -1203,6 +1283,50 @@
           <w:sz w:val="24"/>
           <w:szCs w:val="24"/>
           <w:lang w:eastAsia="es-ES"/>
+        </w:rPr>
+        <w:t>.</w:t>
+      </w:r>
+    </w:p>
+    <w:p>
+      <w:pPr>
+        <w:shd w:val="clear" w:color="auto" w:fill="FFFFFF"/>
+        <w:spacing w:after="100" w:afterAutospacing="1" w:line="240" w:lineRule="auto"/>
+        <w:rPr>
+          <w:rFonts w:ascii="Arial" w:eastAsia="Times New Roman" w:hAnsi="Arial" w:cs="Arial"/>
+          <w:color w:val="000000"/>
+          <w:spacing w:val="2"/>
+          <w:sz w:val="24"/>
+          <w:szCs w:val="24"/>
+          <w:lang w:eastAsia="es-ES"/>
+        </w:rPr>
+      </w:pPr>
+      <w:r>
+        <w:rPr>
+          <w:rFonts w:ascii="Arial" w:hAnsi="Arial"/>
+          <w:color w:val="000000"/>
+        </w:rPr>
+        <w:t xml:space="preserve">Aplicación web que tiene como función el gestionar el inventario para diversas </w:t>
+      </w:r>
+      <w:proofErr w:type="spellStart"/>
+      <w:r>
+        <w:rPr>
+          <w:rFonts w:ascii="Arial" w:hAnsi="Arial"/>
+          <w:color w:val="000000"/>
+        </w:rPr>
+        <w:t>PYMEs</w:t>
+      </w:r>
+      <w:proofErr w:type="spellEnd"/>
+      <w:r>
+        <w:rPr>
+          <w:rFonts w:ascii="Arial" w:hAnsi="Arial"/>
+          <w:color w:val="000000"/>
+        </w:rPr>
+        <w:t>, con el objeto de que los clientes puedan consultar la disponibilidad y realizar comparativa de la diversidad de cada producto</w:t>
+      </w:r>
+      <w:r>
+        <w:rPr>
+          <w:rFonts w:ascii="Arial" w:hAnsi="Arial"/>
+          <w:color w:val="000000"/>
         </w:rPr>
         <w:t>.</w:t>
       </w:r>
@@ -1385,7 +1509,7 @@
     </w:p>
     <w:p>
       <w:pPr>
-        <w:pStyle w:val="Prrafodelista"/>
+        <w:pStyle w:val="ListParagraph"/>
         <w:numPr>
           <w:ilvl w:val="0"/>
           <w:numId w:val="4"/>
@@ -1410,12 +1534,13 @@
           <w:szCs w:val="24"/>
           <w:lang w:eastAsia="es-ES"/>
         </w:rPr>
+        <w:lastRenderedPageBreak/>
         <w:t xml:space="preserve">Verde para indicar que está bien. </w:t>
       </w:r>
     </w:p>
     <w:p>
       <w:pPr>
-        <w:pStyle w:val="Prrafodelista"/>
+        <w:pStyle w:val="ListParagraph"/>
         <w:numPr>
           <w:ilvl w:val="0"/>
           <w:numId w:val="4"/>
@@ -1445,7 +1570,7 @@
     </w:p>
     <w:p>
       <w:pPr>
-        <w:pStyle w:val="Prrafodelista"/>
+        <w:pStyle w:val="ListParagraph"/>
         <w:numPr>
           <w:ilvl w:val="0"/>
           <w:numId w:val="4"/>
@@ -1497,7 +1622,7 @@
     </w:p>
     <w:p>
       <w:pPr>
-        <w:pStyle w:val="Prrafodelista"/>
+        <w:pStyle w:val="ListParagraph"/>
         <w:numPr>
           <w:ilvl w:val="0"/>
           <w:numId w:val="4"/>
@@ -1522,7 +1647,6 @@
           <w:szCs w:val="24"/>
           <w:lang w:eastAsia="es-ES"/>
         </w:rPr>
-        <w:lastRenderedPageBreak/>
         <w:t xml:space="preserve">Una </w:t>
       </w:r>
       <w:r>
@@ -1601,6 +1725,119 @@
           <w:lang w:eastAsia="es-ES"/>
         </w:rPr>
         <w:t>il y ayudará a interpretar el semáforo.</w:t>
+      </w:r>
+    </w:p>
+    <w:p>
+      <w:pPr>
+        <w:shd w:val="clear" w:color="auto" w:fill="FFFFFF"/>
+        <w:spacing w:after="100" w:afterAutospacing="1"/>
+        <w:rPr>
+          <w:rFonts w:ascii="Arial" w:eastAsia="Times New Roman" w:hAnsi="Arial" w:cs="Arial"/>
+          <w:color w:val="000000"/>
+          <w:spacing w:val="2"/>
+          <w:sz w:val="24"/>
+          <w:szCs w:val="24"/>
+          <w:lang w:eastAsia="es-ES"/>
+        </w:rPr>
+      </w:pPr>
+      <w:r>
+        <w:rPr>
+          <w:rFonts w:ascii="Arial" w:eastAsia="Times New Roman" w:hAnsi="Arial" w:cs="Arial"/>
+          <w:noProof/>
+          <w:color w:val="000000"/>
+          <w:spacing w:val="2"/>
+          <w:sz w:val="24"/>
+          <w:szCs w:val="24"/>
+          <w:lang w:eastAsia="es-ES"/>
+        </w:rPr>
+        <mc:AlternateContent>
+          <mc:Choice Requires="wpc">
+            <w:drawing>
+              <wp:inline distT="0" distB="0" distL="0" distR="0" wp14:anchorId="28694629" wp14:editId="09BFE4A3">
+                <wp:extent cx="5400040" cy="952501"/>
+                <wp:effectExtent l="0" t="0" r="0" b="0"/>
+                <wp:docPr id="1196007786" name="Canvas 2"/>
+                <wp:cNvGraphicFramePr>
+                  <a:graphicFrameLocks xmlns:a="http://schemas.openxmlformats.org/drawingml/2006/main" noChangeAspect="1"/>
+                </wp:cNvGraphicFramePr>
+                <a:graphic xmlns:a="http://schemas.openxmlformats.org/drawingml/2006/main">
+                  <a:graphicData uri="http://schemas.microsoft.com/office/word/2010/wordprocessingCanvas">
+                    <wpc:wpc>
+                      <wpc:bg>
+                        <a:solidFill>
+                          <a:prstClr val="white"/>
+                        </a:solidFill>
+                      </wpc:bg>
+                      <wpc:whole/>
+                      <pic:pic xmlns:pic="http://schemas.openxmlformats.org/drawingml/2006/picture">
+                        <pic:nvPicPr>
+                          <pic:cNvPr id="739644941" name="Graphic 739644941" descr="Grinning face outline with solid fill"/>
+                          <pic:cNvPicPr>
+                            <a:picLocks noChangeAspect="1"/>
+                          </pic:cNvPicPr>
+                        </pic:nvPicPr>
+                        <pic:blipFill>
+                          <a:blip r:embed="rId16">
+                            <a:extLst>
+                              <a:ext uri="{96DAC541-7B7A-43D3-8B79-37D633B846F1}">
+                                <asvg:svgBlip xmlns:asvg="http://schemas.microsoft.com/office/drawing/2016/SVG/main" r:embed="rId17"/>
+                              </a:ext>
+                            </a:extLst>
+                          </a:blip>
+                          <a:stretch>
+                            <a:fillRect/>
+                          </a:stretch>
+                        </pic:blipFill>
+                        <pic:spPr>
+                          <a:xfrm>
+                            <a:off x="2242820" y="38101"/>
+                            <a:ext cx="914400" cy="914400"/>
+                          </a:xfrm>
+                          <a:prstGeom prst="rect">
+                            <a:avLst/>
+                          </a:prstGeom>
+                        </pic:spPr>
+                      </pic:pic>
+                    </wpc:wpc>
+                  </a:graphicData>
+                </a:graphic>
+              </wp:inline>
+            </w:drawing>
+          </mc:Choice>
+          <mc:Fallback>
+            <w:pict>
+              <v:group w14:anchorId="6A69D0DA" id="Canvas 2" o:spid="_x0000_s1026" editas="canvas" style="width:425.2pt;height:75pt;mso-position-horizontal-relative:char;mso-position-vertical-relative:line" coordsize="54000,9525" o:gfxdata="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">
+                <v:shapetype id="_x0000_t75" coordsize="21600,21600" o:spt="75" o:preferrelative="t" path="m@4@5l@4@11@9@11@9@5xe" filled="f" stroked="f">
+                  <v:stroke joinstyle="miter"/>
+                  <v:formulas>
+                    <v:f eqn="if lineDrawn pixelLineWidth 0"/>
+                    <v:f eqn="sum @0 1 0"/>
+                    <v:f eqn="sum 0 0 @1"/>
+                    <v:f eqn="prod @2 1 2"/>
+                    <v:f eqn="prod @3 21600 pixelWidth"/>
+                    <v:f eqn="prod @3 21600 pixelHeight"/>
+                    <v:f eqn="sum @0 0 1"/>
+                    <v:f eqn="prod @6 1 2"/>
+                    <v:f eqn="prod @7 21600 pixelWidth"/>
+                    <v:f eqn="sum @8 21600 0"/>
+                    <v:f eqn="prod @7 21600 pixelHeight"/>
+                    <v:f eqn="sum @10 21600 0"/>
+                  </v:formulas>
+                  <v:path o:extrusionok="f" gradientshapeok="t" o:connecttype="rect"/>
+                  <o:lock v:ext="edit" aspectratio="t"/>
+                </v:shapetype>
+                <v:shape id="_x0000_s1027" type="#_x0000_t75" style="position:absolute;width:54000;height:9525;visibility:visible;mso-wrap-style:square" filled="t">
+                  <v:fill o:detectmouseclick="t"/>
+                  <v:path o:connecttype="none"/>
+                </v:shape>
+                <v:shape id="Graphic 739644941" o:spid="_x0000_s1028" type="#_x0000_t75" alt="Grinning face outline with solid fill" style="position:absolute;left:22428;top:381;width:9144;height:9144;visibility:visible;mso-wrap-style:square" o:gfxdata="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">
+                  <v:imagedata r:id="rId18" o:title="Grinning face outline with solid fill"/>
+                </v:shape>
+                <w10:anchorlock/>
+              </v:group>
+            </w:pict>
+          </mc:Fallback>
+        </mc:AlternateContent>
       </w:r>
     </w:p>
     <w:p>
@@ -1726,7 +1963,7 @@
     </w:p>
     <w:p>
       <w:pPr>
-        <w:pStyle w:val="Prrafodelista"/>
+        <w:pStyle w:val="ListParagraph"/>
         <w:numPr>
           <w:ilvl w:val="0"/>
           <w:numId w:val="5"/>
@@ -1756,7 +1993,7 @@
     </w:p>
     <w:p>
       <w:pPr>
-        <w:pStyle w:val="Prrafodelista"/>
+        <w:pStyle w:val="ListParagraph"/>
         <w:numPr>
           <w:ilvl w:val="0"/>
           <w:numId w:val="5"/>
@@ -1780,7 +2017,7 @@
     </w:p>
     <w:p>
       <w:pPr>
-        <w:pStyle w:val="Prrafodelista"/>
+        <w:pStyle w:val="ListParagraph"/>
         <w:numPr>
           <w:ilvl w:val="0"/>
           <w:numId w:val="5"/>
@@ -1804,7 +2041,7 @@
     </w:p>
     <w:p>
       <w:pPr>
-        <w:pStyle w:val="Prrafodelista"/>
+        <w:pStyle w:val="ListParagraph"/>
         <w:numPr>
           <w:ilvl w:val="0"/>
           <w:numId w:val="5"/>
@@ -1847,7 +2084,7 @@
     </w:p>
     <w:p>
       <w:pPr>
-        <w:pStyle w:val="Prrafodelista"/>
+        <w:pStyle w:val="ListParagraph"/>
         <w:numPr>
           <w:ilvl w:val="0"/>
           <w:numId w:val="5"/>
@@ -1888,7 +2125,7 @@
     </w:p>
     <w:p>
       <w:pPr>
-        <w:pStyle w:val="Prrafodelista"/>
+        <w:pStyle w:val="ListParagraph"/>
         <w:numPr>
           <w:ilvl w:val="0"/>
           <w:numId w:val="5"/>
@@ -1919,157 +2156,345 @@
     <w:p>
       <w:pPr>
         <w:shd w:val="clear" w:color="auto" w:fill="FFFFFF"/>
-        <w:spacing w:before="100" w:beforeAutospacing="1" w:after="100" w:afterAutospacing="1" w:line="240" w:lineRule="auto"/>
-        <w:outlineLvl w:val="3"/>
-        <w:rPr>
-          <w:rFonts w:ascii="var(--font-family-headings)" w:eastAsia="Times New Roman" w:hAnsi="var(--font-family-headings)" w:cs="Times New Roman"/>
-          <w:b/>
-          <w:bCs/>
-          <w:color w:val="000000"/>
-          <w:spacing w:val="-2"/>
-          <w:sz w:val="24"/>
-          <w:szCs w:val="24"/>
-          <w:lang w:eastAsia="es-ES"/>
-        </w:rPr>
-      </w:pPr>
-      <w:r>
-        <w:rPr>
-          <w:rFonts w:ascii="var(--font-family-headings)" w:eastAsia="Times New Roman" w:hAnsi="var(--font-family-headings)" w:cs="Times New Roman"/>
-          <w:b/>
-          <w:bCs/>
-          <w:color w:val="000000"/>
-          <w:spacing w:val="-2"/>
-          <w:sz w:val="24"/>
-          <w:szCs w:val="24"/>
-          <w:lang w:eastAsia="es-ES"/>
-        </w:rPr>
-        <w:t xml:space="preserve">5. Lo que </w:t>
-      </w:r>
-      <w:r>
-        <w:rPr>
-          <w:rFonts w:ascii="var(--font-family-headings)" w:eastAsia="Times New Roman" w:hAnsi="var(--font-family-headings)" w:cs="Times New Roman"/>
-          <w:b/>
-          <w:bCs/>
-          <w:color w:val="000000"/>
-          <w:spacing w:val="-2"/>
-          <w:sz w:val="24"/>
-          <w:szCs w:val="24"/>
-          <w:lang w:eastAsia="es-ES"/>
-        </w:rPr>
-        <w:t>planeamos realizar en la pr</w:t>
-      </w:r>
-      <w:r>
-        <w:rPr>
-          <w:rFonts w:ascii="var(--font-family-headings)" w:eastAsia="Times New Roman" w:hAnsi="var(--font-family-headings)" w:cs="Times New Roman" w:hint="eastAsia"/>
-          <w:b/>
-          <w:bCs/>
-          <w:color w:val="000000"/>
-          <w:spacing w:val="-2"/>
-          <w:sz w:val="24"/>
-          <w:szCs w:val="24"/>
-          <w:lang w:eastAsia="es-ES"/>
-        </w:rPr>
-        <w:t>ó</w:t>
-      </w:r>
-      <w:r>
-        <w:rPr>
-          <w:rFonts w:ascii="var(--font-family-headings)" w:eastAsia="Times New Roman" w:hAnsi="var(--font-family-headings)" w:cs="Times New Roman"/>
-          <w:b/>
-          <w:bCs/>
-          <w:color w:val="000000"/>
-          <w:spacing w:val="-2"/>
-          <w:sz w:val="24"/>
-          <w:szCs w:val="24"/>
-          <w:lang w:eastAsia="es-ES"/>
-        </w:rPr>
-        <w:t xml:space="preserve">xima </w:t>
-      </w:r>
-      <w:r>
-        <w:rPr>
-          <w:rFonts w:ascii="var(--font-family-headings)" w:eastAsia="Times New Roman" w:hAnsi="var(--font-family-headings)" w:cs="Times New Roman"/>
-          <w:b/>
-          <w:bCs/>
-          <w:color w:val="000000"/>
-          <w:spacing w:val="-2"/>
-          <w:sz w:val="24"/>
-          <w:szCs w:val="24"/>
-          <w:lang w:eastAsia="es-ES"/>
-        </w:rPr>
-        <w:t>etapa</w:t>
-      </w:r>
-      <w:r>
-        <w:rPr>
-          <w:rFonts w:ascii="var(--font-family-headings)" w:eastAsia="Times New Roman" w:hAnsi="var(--font-family-headings)" w:cs="Times New Roman"/>
-          <w:b/>
-          <w:bCs/>
-          <w:color w:val="000000"/>
-          <w:spacing w:val="-2"/>
-          <w:sz w:val="24"/>
-          <w:szCs w:val="24"/>
-          <w:lang w:eastAsia="es-ES"/>
-        </w:rPr>
-        <w:t xml:space="preserve"> </w:t>
-      </w:r>
-      <w:r>
-        <w:rPr>
-          <w:rFonts w:ascii="var(--font-family-headings)" w:eastAsia="Times New Roman" w:hAnsi="var(--font-family-headings)" w:cs="Times New Roman"/>
-          <w:b/>
-          <w:bCs/>
-          <w:color w:val="000000"/>
-          <w:spacing w:val="-2"/>
-          <w:sz w:val="24"/>
-          <w:szCs w:val="24"/>
-          <w:lang w:eastAsia="es-ES"/>
-        </w:rPr>
-        <w:t>(próxima Minuta)</w:t>
-      </w:r>
+        <w:spacing w:after="100" w:afterAutospacing="1"/>
+        <w:rPr>
+          <w:rFonts w:ascii="Arial" w:eastAsia="Times New Roman" w:hAnsi="Arial" w:cs="Arial"/>
+          <w:color w:val="000000"/>
+          <w:spacing w:val="2"/>
+          <w:sz w:val="24"/>
+          <w:szCs w:val="24"/>
+          <w:lang w:eastAsia="es-ES"/>
+        </w:rPr>
+      </w:pPr>
     </w:p>
     <w:p>
       <w:pPr>
         <w:shd w:val="clear" w:color="auto" w:fill="FFFFFF"/>
-        <w:spacing w:after="100" w:afterAutospacing="1" w:line="240" w:lineRule="auto"/>
-        <w:rPr>
-          <w:rFonts w:ascii="Arial" w:eastAsia="Times New Roman" w:hAnsi="Arial" w:cs="Arial"/>
-          <w:color w:val="000000"/>
-          <w:spacing w:val="2"/>
-          <w:sz w:val="24"/>
-          <w:szCs w:val="24"/>
-          <w:lang w:eastAsia="es-ES"/>
-        </w:rPr>
-      </w:pPr>
-      <w:r>
-        <w:rPr>
-          <w:rFonts w:ascii="Arial" w:eastAsia="Times New Roman" w:hAnsi="Arial" w:cs="Arial"/>
-          <w:color w:val="000000"/>
-          <w:spacing w:val="2"/>
-          <w:sz w:val="24"/>
-          <w:szCs w:val="24"/>
-          <w:lang w:eastAsia="es-ES"/>
-        </w:rPr>
-        <w:t xml:space="preserve">Lista de tareas clara y precisa que debe ser presentada en </w:t>
-      </w:r>
-      <w:r>
-        <w:rPr>
-          <w:rFonts w:ascii="Arial" w:eastAsia="Times New Roman" w:hAnsi="Arial" w:cs="Arial"/>
-          <w:color w:val="000000"/>
-          <w:spacing w:val="2"/>
-          <w:sz w:val="24"/>
-          <w:szCs w:val="24"/>
-          <w:u w:val="single"/>
-          <w:lang w:eastAsia="es-ES"/>
-        </w:rPr>
-        <w:t>formato de viñeta</w:t>
-      </w:r>
-      <w:r>
-        <w:rPr>
-          <w:rFonts w:ascii="Arial" w:eastAsia="Times New Roman" w:hAnsi="Arial" w:cs="Arial"/>
-          <w:color w:val="000000"/>
-          <w:spacing w:val="2"/>
-          <w:sz w:val="24"/>
-          <w:szCs w:val="24"/>
-          <w:lang w:eastAsia="es-ES"/>
-        </w:rPr>
-        <w:t>.</w:t>
+        <w:spacing w:after="100" w:afterAutospacing="1"/>
+        <w:rPr>
+          <w:rFonts w:ascii="Arial" w:eastAsia="Times New Roman" w:hAnsi="Arial" w:cs="Arial"/>
+          <w:color w:val="000000"/>
+          <w:spacing w:val="2"/>
+          <w:sz w:val="24"/>
+          <w:szCs w:val="24"/>
+          <w:lang w:eastAsia="es-ES"/>
+        </w:rPr>
+      </w:pPr>
+    </w:p>
+    <w:p>
+      <w:pPr>
+        <w:shd w:val="clear" w:color="auto" w:fill="FFFFFF"/>
+        <w:spacing w:after="100" w:afterAutospacing="1"/>
+        <w:rPr>
+          <w:rFonts w:ascii="Arial" w:eastAsia="Times New Roman" w:hAnsi="Arial" w:cs="Arial"/>
+          <w:color w:val="000000"/>
+          <w:spacing w:val="2"/>
+          <w:sz w:val="24"/>
+          <w:szCs w:val="24"/>
+          <w:lang w:eastAsia="es-ES"/>
+        </w:rPr>
+      </w:pPr>
+    </w:p>
+    <w:p>
+      <w:pPr>
+        <w:shd w:val="clear" w:color="auto" w:fill="FFFFFF"/>
+        <w:spacing w:after="100" w:afterAutospacing="1"/>
+        <w:rPr>
+          <w:rFonts w:ascii="Arial" w:eastAsia="Times New Roman" w:hAnsi="Arial" w:cs="Arial"/>
+          <w:color w:val="000000"/>
+          <w:spacing w:val="2"/>
+          <w:sz w:val="24"/>
+          <w:szCs w:val="24"/>
+          <w:lang w:eastAsia="es-ES"/>
+        </w:rPr>
+      </w:pPr>
+    </w:p>
+    <w:p>
+      <w:pPr>
+        <w:shd w:val="clear" w:color="auto" w:fill="FFFFFF"/>
+        <w:spacing w:after="100" w:afterAutospacing="1"/>
+        <w:rPr>
+          <w:rFonts w:ascii="Arial" w:eastAsia="Times New Roman" w:hAnsi="Arial" w:cs="Arial"/>
+          <w:color w:val="000000"/>
+          <w:spacing w:val="2"/>
+          <w:sz w:val="24"/>
+          <w:szCs w:val="24"/>
+          <w:lang w:eastAsia="es-ES"/>
+        </w:rPr>
+      </w:pPr>
+    </w:p>
+    <w:p>
+      <w:pPr>
+        <w:shd w:val="clear" w:color="auto" w:fill="FFFFFF"/>
+        <w:spacing w:after="100" w:afterAutospacing="1"/>
+        <w:rPr>
+          <w:rFonts w:ascii="Arial" w:eastAsia="Times New Roman" w:hAnsi="Arial" w:cs="Arial"/>
+          <w:color w:val="000000"/>
+          <w:spacing w:val="2"/>
+          <w:sz w:val="24"/>
+          <w:szCs w:val="24"/>
+          <w:lang w:eastAsia="es-ES"/>
+        </w:rPr>
+      </w:pPr>
+    </w:p>
+    <w:p>
+      <w:pPr>
+        <w:shd w:val="clear" w:color="auto" w:fill="FFFFFF"/>
+        <w:spacing w:after="100" w:afterAutospacing="1"/>
+        <w:rPr>
+          <w:rFonts w:ascii="Arial" w:eastAsia="Times New Roman" w:hAnsi="Arial" w:cs="Arial"/>
+          <w:color w:val="000000"/>
+          <w:spacing w:val="2"/>
+          <w:sz w:val="24"/>
+          <w:szCs w:val="24"/>
+          <w:lang w:eastAsia="es-ES"/>
+        </w:rPr>
+      </w:pPr>
+      <w:r>
+        <w:rPr>
+          <w:rFonts w:ascii="Arial" w:eastAsia="Times New Roman" w:hAnsi="Arial" w:cs="Arial"/>
+          <w:color w:val="000000"/>
+          <w:spacing w:val="2"/>
+          <w:sz w:val="24"/>
+          <w:szCs w:val="24"/>
+          <w:lang w:eastAsia="es-ES"/>
+        </w:rPr>
+        <w:drawing>
+          <wp:inline distT="0" distB="0" distL="0" distR="0" wp14:anchorId="425C9157" wp14:editId="1B86B6CB">
+            <wp:extent cx="5400040" cy="1821815"/>
+            <wp:effectExtent l="0" t="0" r="0" b="6985"/>
+            <wp:docPr id="1577333081" name="Picture 1"/>
+            <wp:cNvGraphicFramePr>
+              <a:graphicFrameLocks xmlns:a="http://schemas.openxmlformats.org/drawingml/2006/main" noChangeAspect="1"/>
+            </wp:cNvGraphicFramePr>
+            <a:graphic xmlns:a="http://schemas.openxmlformats.org/drawingml/2006/main">
+              <a:graphicData uri="http://schemas.openxmlformats.org/drawingml/2006/picture">
+                <pic:pic xmlns:pic="http://schemas.openxmlformats.org/drawingml/2006/picture">
+                  <pic:nvPicPr>
+                    <pic:cNvPr id="1577333081" name=""/>
+                    <pic:cNvPicPr/>
+                  </pic:nvPicPr>
+                  <pic:blipFill>
+                    <a:blip r:embed="rId19"/>
+                    <a:stretch>
+                      <a:fillRect/>
+                    </a:stretch>
+                  </pic:blipFill>
+                  <pic:spPr>
+                    <a:xfrm>
+                      <a:off x="0" y="0"/>
+                      <a:ext cx="5400040" cy="1821815"/>
+                    </a:xfrm>
+                    <a:prstGeom prst="rect">
+                      <a:avLst/>
+                    </a:prstGeom>
+                  </pic:spPr>
+                </pic:pic>
+              </a:graphicData>
+            </a:graphic>
+          </wp:inline>
+        </w:drawing>
+      </w:r>
+    </w:p>
+    <w:p>
+      <w:pPr>
+        <w:shd w:val="clear" w:color="auto" w:fill="FFFFFF"/>
+        <w:spacing w:after="100" w:afterAutospacing="1"/>
+        <w:rPr>
+          <w:rFonts w:ascii="Arial" w:eastAsia="Times New Roman" w:hAnsi="Arial" w:cs="Arial"/>
+          <w:color w:val="000000"/>
+          <w:spacing w:val="2"/>
+          <w:sz w:val="24"/>
+          <w:szCs w:val="24"/>
+          <w:lang w:eastAsia="es-ES"/>
+        </w:rPr>
+      </w:pPr>
+      <w:r>
+        <w:rPr>
+          <w:noProof/>
+        </w:rPr>
+        <w:lastRenderedPageBreak/>
+        <w:drawing>
+          <wp:inline distT="0" distB="0" distL="0" distR="0" wp14:anchorId="0B9DA3DC" wp14:editId="705DDE23">
+            <wp:extent cx="5400040" cy="2913380"/>
+            <wp:effectExtent l="0" t="0" r="0" b="1270"/>
+            <wp:docPr id="1928000718" name="Picture 3"/>
+            <wp:cNvGraphicFramePr>
+              <a:graphicFrameLocks xmlns:a="http://schemas.openxmlformats.org/drawingml/2006/main" noChangeAspect="1"/>
+            </wp:cNvGraphicFramePr>
+            <a:graphic xmlns:a="http://schemas.openxmlformats.org/drawingml/2006/main">
+              <a:graphicData uri="http://schemas.openxmlformats.org/drawingml/2006/picture">
+                <pic:pic xmlns:pic="http://schemas.openxmlformats.org/drawingml/2006/picture">
+                  <pic:nvPicPr>
+                    <pic:cNvPr id="0" name="Picture 1"/>
+                    <pic:cNvPicPr>
+                      <a:picLocks noChangeAspect="1" noChangeArrowheads="1"/>
+                    </pic:cNvPicPr>
+                  </pic:nvPicPr>
+                  <pic:blipFill>
+                    <a:blip r:embed="rId20" cstate="print">
+                      <a:extLst>
+                        <a:ext uri="{28A0092B-C50C-407E-A947-70E740481C1C}">
+                          <a14:useLocalDpi xmlns:a14="http://schemas.microsoft.com/office/drawing/2010/main" val="0"/>
+                        </a:ext>
+                      </a:extLst>
+                    </a:blip>
+                    <a:srcRect/>
+                    <a:stretch>
+                      <a:fillRect/>
+                    </a:stretch>
+                  </pic:blipFill>
+                  <pic:spPr bwMode="auto">
+                    <a:xfrm>
+                      <a:off x="0" y="0"/>
+                      <a:ext cx="5400040" cy="2913380"/>
+                    </a:xfrm>
+                    <a:prstGeom prst="rect">
+                      <a:avLst/>
+                    </a:prstGeom>
+                    <a:noFill/>
+                    <a:ln>
+                      <a:noFill/>
+                    </a:ln>
+                  </pic:spPr>
+                </pic:pic>
+              </a:graphicData>
+            </a:graphic>
+          </wp:inline>
+        </w:drawing>
+      </w:r>
+    </w:p>
+    <w:p>
+      <w:pPr>
+        <w:shd w:val="clear" w:color="auto" w:fill="FFFFFF"/>
+        <w:spacing w:after="100" w:afterAutospacing="1"/>
+        <w:rPr>
+          <w:rFonts w:ascii="Arial" w:eastAsia="Times New Roman" w:hAnsi="Arial" w:cs="Arial"/>
+          <w:color w:val="000000"/>
+          <w:spacing w:val="2"/>
+          <w:sz w:val="24"/>
+          <w:szCs w:val="24"/>
+          <w:lang w:eastAsia="es-ES"/>
+        </w:rPr>
+      </w:pPr>
+      <w:r>
+        <w:rPr>
+          <w:rFonts w:ascii="Arial" w:eastAsia="Times New Roman" w:hAnsi="Arial" w:cs="Arial"/>
+          <w:color w:val="000000"/>
+          <w:spacing w:val="2"/>
+          <w:sz w:val="24"/>
+          <w:szCs w:val="24"/>
+          <w:lang w:eastAsia="es-ES"/>
+        </w:rPr>
+        <w:drawing>
+          <wp:inline distT="0" distB="0" distL="0" distR="0" wp14:anchorId="77E087B2" wp14:editId="549E3596">
+            <wp:extent cx="5400040" cy="2512060"/>
+            <wp:effectExtent l="0" t="0" r="0" b="2540"/>
+            <wp:docPr id="1405361303" name="Picture 1"/>
+            <wp:cNvGraphicFramePr>
+              <a:graphicFrameLocks xmlns:a="http://schemas.openxmlformats.org/drawingml/2006/main" noChangeAspect="1"/>
+            </wp:cNvGraphicFramePr>
+            <a:graphic xmlns:a="http://schemas.openxmlformats.org/drawingml/2006/main">
+              <a:graphicData uri="http://schemas.openxmlformats.org/drawingml/2006/picture">
+                <pic:pic xmlns:pic="http://schemas.openxmlformats.org/drawingml/2006/picture">
+                  <pic:nvPicPr>
+                    <pic:cNvPr id="1405361303" name=""/>
+                    <pic:cNvPicPr/>
+                  </pic:nvPicPr>
+                  <pic:blipFill>
+                    <a:blip r:embed="rId21"/>
+                    <a:stretch>
+                      <a:fillRect/>
+                    </a:stretch>
+                  </pic:blipFill>
+                  <pic:spPr>
+                    <a:xfrm>
+                      <a:off x="0" y="0"/>
+                      <a:ext cx="5400040" cy="2512060"/>
+                    </a:xfrm>
+                    <a:prstGeom prst="rect">
+                      <a:avLst/>
+                    </a:prstGeom>
+                  </pic:spPr>
+                </pic:pic>
+              </a:graphicData>
+            </a:graphic>
+          </wp:inline>
+        </w:drawing>
+      </w:r>
+    </w:p>
+    <w:p>
+      <w:pPr>
+        <w:shd w:val="clear" w:color="auto" w:fill="FFFFFF"/>
+        <w:spacing w:after="100" w:afterAutospacing="1"/>
+        <w:rPr>
+          <w:rFonts w:ascii="Arial" w:eastAsia="Times New Roman" w:hAnsi="Arial" w:cs="Arial"/>
+          <w:color w:val="000000"/>
+          <w:spacing w:val="2"/>
+          <w:sz w:val="24"/>
+          <w:szCs w:val="24"/>
+          <w:lang w:eastAsia="es-ES"/>
+        </w:rPr>
+      </w:pPr>
+    </w:p>
+    <w:p>
+      <w:pPr>
+        <w:shd w:val="clear" w:color="auto" w:fill="FFFFFF"/>
+        <w:spacing w:after="100" w:afterAutospacing="1"/>
+        <w:rPr>
+          <w:rFonts w:ascii="Arial" w:eastAsia="Times New Roman" w:hAnsi="Arial" w:cs="Arial"/>
+          <w:color w:val="000000"/>
+          <w:spacing w:val="2"/>
+          <w:sz w:val="24"/>
+          <w:szCs w:val="24"/>
+          <w:lang w:eastAsia="es-ES"/>
+        </w:rPr>
+      </w:pPr>
+      <w:r>
+        <w:rPr>
+          <w:rFonts w:ascii="Arial" w:eastAsia="Times New Roman" w:hAnsi="Arial" w:cs="Arial"/>
+          <w:color w:val="000000"/>
+          <w:spacing w:val="2"/>
+          <w:sz w:val="24"/>
+          <w:szCs w:val="24"/>
+          <w:lang w:eastAsia="es-ES"/>
+        </w:rPr>
+        <w:lastRenderedPageBreak/>
+        <w:drawing>
+          <wp:inline distT="0" distB="0" distL="0" distR="0" wp14:anchorId="720094A9" wp14:editId="10DC5963">
+            <wp:extent cx="5400040" cy="3674110"/>
+            <wp:effectExtent l="0" t="0" r="0" b="2540"/>
+            <wp:docPr id="1022120420" name="Picture 1"/>
+            <wp:cNvGraphicFramePr>
+              <a:graphicFrameLocks xmlns:a="http://schemas.openxmlformats.org/drawingml/2006/main" noChangeAspect="1"/>
+            </wp:cNvGraphicFramePr>
+            <a:graphic xmlns:a="http://schemas.openxmlformats.org/drawingml/2006/main">
+              <a:graphicData uri="http://schemas.openxmlformats.org/drawingml/2006/picture">
+                <pic:pic xmlns:pic="http://schemas.openxmlformats.org/drawingml/2006/picture">
+                  <pic:nvPicPr>
+                    <pic:cNvPr id="1022120420" name=""/>
+                    <pic:cNvPicPr/>
+                  </pic:nvPicPr>
+                  <pic:blipFill>
+                    <a:blip r:embed="rId22"/>
+                    <a:stretch>
+                      <a:fillRect/>
+                    </a:stretch>
+                  </pic:blipFill>
+                  <pic:spPr>
+                    <a:xfrm>
+                      <a:off x="0" y="0"/>
+                      <a:ext cx="5400040" cy="3674110"/>
+                    </a:xfrm>
+                    <a:prstGeom prst="rect">
+                      <a:avLst/>
+                    </a:prstGeom>
+                  </pic:spPr>
+                </pic:pic>
+              </a:graphicData>
+            </a:graphic>
+          </wp:inline>
+        </w:drawing>
       </w:r>
     </w:p>
     <w:p>
@@ -2099,7 +2524,85 @@
           <w:szCs w:val="24"/>
           <w:lang w:eastAsia="es-ES"/>
         </w:rPr>
-        <w:t>6. Problemas / Obstáculos</w:t>
+        <w:t xml:space="preserve">5. Lo que </w:t>
+      </w:r>
+      <w:r>
+        <w:rPr>
+          <w:rFonts w:ascii="var(--font-family-headings)" w:eastAsia="Times New Roman" w:hAnsi="var(--font-family-headings)" w:cs="Times New Roman"/>
+          <w:b/>
+          <w:bCs/>
+          <w:color w:val="000000"/>
+          <w:spacing w:val="-2"/>
+          <w:sz w:val="24"/>
+          <w:szCs w:val="24"/>
+          <w:lang w:eastAsia="es-ES"/>
+        </w:rPr>
+        <w:t>planeamos realizar en la pr</w:t>
+      </w:r>
+      <w:r>
+        <w:rPr>
+          <w:rFonts w:ascii="var(--font-family-headings)" w:eastAsia="Times New Roman" w:hAnsi="var(--font-family-headings)" w:cs="Times New Roman" w:hint="eastAsia"/>
+          <w:b/>
+          <w:bCs/>
+          <w:color w:val="000000"/>
+          <w:spacing w:val="-2"/>
+          <w:sz w:val="24"/>
+          <w:szCs w:val="24"/>
+          <w:lang w:eastAsia="es-ES"/>
+        </w:rPr>
+        <w:t>ó</w:t>
+      </w:r>
+      <w:r>
+        <w:rPr>
+          <w:rFonts w:ascii="var(--font-family-headings)" w:eastAsia="Times New Roman" w:hAnsi="var(--font-family-headings)" w:cs="Times New Roman"/>
+          <w:b/>
+          <w:bCs/>
+          <w:color w:val="000000"/>
+          <w:spacing w:val="-2"/>
+          <w:sz w:val="24"/>
+          <w:szCs w:val="24"/>
+          <w:lang w:eastAsia="es-ES"/>
+        </w:rPr>
+        <w:t xml:space="preserve">xima </w:t>
+      </w:r>
+      <w:r>
+        <w:rPr>
+          <w:rFonts w:ascii="var(--font-family-headings)" w:eastAsia="Times New Roman" w:hAnsi="var(--font-family-headings)" w:cs="Times New Roman"/>
+          <w:b/>
+          <w:bCs/>
+          <w:color w:val="000000"/>
+          <w:spacing w:val="-2"/>
+          <w:sz w:val="24"/>
+          <w:szCs w:val="24"/>
+          <w:lang w:eastAsia="es-ES"/>
+        </w:rPr>
+        <w:t>etapa</w:t>
+      </w:r>
+      <w:r>
+        <w:rPr>
+          <w:rFonts w:ascii="var(--font-family-headings)" w:eastAsia="Times New Roman" w:hAnsi="var(--font-family-headings)" w:cs="Times New Roman"/>
+          <w:b/>
+          <w:bCs/>
+          <w:color w:val="000000"/>
+          <w:spacing w:val="-2"/>
+          <w:sz w:val="24"/>
+          <w:szCs w:val="24"/>
+          <w:lang w:eastAsia="es-ES"/>
+        </w:rPr>
+        <w:t xml:space="preserve"> </w:t>
+      </w:r>
+      <w:r>
+        <w:rPr>
+          <w:rFonts w:ascii="var(--font-family-headings)" w:eastAsia="Times New Roman" w:hAnsi="var(--font-family-headings)" w:cs="Times New Roman"/>
+          <w:b/>
+          <w:bCs/>
+          <w:color w:val="000000"/>
+          <w:spacing w:val="-2"/>
+          <w:sz w:val="24"/>
+          <w:szCs w:val="24"/>
+          <w:lang w:eastAsia="es-ES"/>
+        </w:rPr>
+        <w:t>(próxima Minuta)</w:t>
       </w:r>
     </w:p>
     <w:p>
@@ -2124,7 +2627,30 @@
           <w:szCs w:val="24"/>
           <w:lang w:eastAsia="es-ES"/>
         </w:rPr>
-        <w:t>Aquí es donde puedes prever cualquier problema u obstáculo que te impida avanzar.</w:t>
+        <w:t xml:space="preserve">Lista de tareas clara y precisa que debe ser presentada en </w:t>
+      </w:r>
+      <w:r>
+        <w:rPr>
+          <w:rFonts w:ascii="Arial" w:eastAsia="Times New Roman" w:hAnsi="Arial" w:cs="Arial"/>
+          <w:color w:val="000000"/>
+          <w:spacing w:val="2"/>
+          <w:sz w:val="24"/>
+          <w:szCs w:val="24"/>
+          <w:u w:val="single"/>
+          <w:lang w:eastAsia="es-ES"/>
+        </w:rPr>
+        <w:t>formato de viñeta</w:t>
+      </w:r>
+      <w:r>
+        <w:rPr>
+          <w:rFonts w:ascii="Arial" w:eastAsia="Times New Roman" w:hAnsi="Arial" w:cs="Arial"/>
+          <w:color w:val="000000"/>
+          <w:spacing w:val="2"/>
+          <w:sz w:val="24"/>
+          <w:szCs w:val="24"/>
+          <w:lang w:eastAsia="es-ES"/>
+        </w:rPr>
+        <w:t>.</w:t>
       </w:r>
     </w:p>
     <w:p>
@@ -2154,7 +2680,7 @@
           <w:szCs w:val="24"/>
           <w:lang w:eastAsia="es-ES"/>
         </w:rPr>
-        <w:t>7. Próximas Tareas y Actividades</w:t>
+        <w:t>6. Problemas / Obstáculos</w:t>
       </w:r>
     </w:p>
     <w:p>
@@ -2179,6 +2705,61 @@
           <w:szCs w:val="24"/>
           <w:lang w:eastAsia="es-ES"/>
         </w:rPr>
+        <w:t>Aquí es donde puedes prever cualquier problema u obstáculo que te impida avanzar.</w:t>
+      </w:r>
+    </w:p>
+    <w:p>
+      <w:pPr>
+        <w:shd w:val="clear" w:color="auto" w:fill="FFFFFF"/>
+        <w:spacing w:before="100" w:beforeAutospacing="1" w:after="100" w:afterAutospacing="1" w:line="240" w:lineRule="auto"/>
+        <w:outlineLvl w:val="3"/>
+        <w:rPr>
+          <w:rFonts w:ascii="var(--font-family-headings)" w:eastAsia="Times New Roman" w:hAnsi="var(--font-family-headings)" w:cs="Times New Roman"/>
+          <w:b/>
+          <w:bCs/>
+          <w:color w:val="000000"/>
+          <w:spacing w:val="-2"/>
+          <w:sz w:val="24"/>
+          <w:szCs w:val="24"/>
+          <w:lang w:eastAsia="es-ES"/>
+        </w:rPr>
+      </w:pPr>
+      <w:r>
+        <w:rPr>
+          <w:rFonts w:ascii="var(--font-family-headings)" w:eastAsia="Times New Roman" w:hAnsi="var(--font-family-headings)" w:cs="Times New Roman"/>
+          <w:b/>
+          <w:bCs/>
+          <w:color w:val="000000"/>
+          <w:spacing w:val="-2"/>
+          <w:sz w:val="24"/>
+          <w:szCs w:val="24"/>
+          <w:lang w:eastAsia="es-ES"/>
+        </w:rPr>
+        <w:t>7. Próximas Tareas y Actividades</w:t>
+      </w:r>
+    </w:p>
+    <w:p>
+      <w:pPr>
+        <w:shd w:val="clear" w:color="auto" w:fill="FFFFFF"/>
+        <w:spacing w:after="100" w:afterAutospacing="1" w:line="240" w:lineRule="auto"/>
+        <w:rPr>
+          <w:rFonts w:ascii="Arial" w:eastAsia="Times New Roman" w:hAnsi="Arial" w:cs="Arial"/>
+          <w:color w:val="000000"/>
+          <w:spacing w:val="2"/>
+          <w:sz w:val="24"/>
+          <w:szCs w:val="24"/>
+          <w:lang w:eastAsia="es-ES"/>
+        </w:rPr>
+      </w:pPr>
+      <w:r>
+        <w:rPr>
+          <w:rFonts w:ascii="Arial" w:eastAsia="Times New Roman" w:hAnsi="Arial" w:cs="Arial"/>
+          <w:color w:val="000000"/>
+          <w:spacing w:val="2"/>
+          <w:sz w:val="24"/>
+          <w:szCs w:val="24"/>
+          <w:lang w:eastAsia="es-ES"/>
+        </w:rPr>
         <w:t xml:space="preserve">Una vista superficial de lo que está sucediendo. ¿Hay algo que el </w:t>
       </w:r>
       <w:r>
@@ -2227,8 +2808,8 @@
       </w:r>
     </w:p>
     <w:sectPr>
-      <w:headerReference w:type="default" r:id="rId16"/>
-      <w:footerReference w:type="default" r:id="rId17"/>
+      <w:headerReference w:type="default" r:id="rId23"/>
+      <w:footerReference w:type="default" r:id="rId24"/>
       <w:type w:val="continuous"/>
       <w:pgSz w:w="11906" w:h="16838"/>
       <w:pgMar w:top="1417" w:right="1701" w:bottom="1417" w:left="1701" w:header="708" w:footer="306" w:gutter="0"/>
@@ -2268,7 +2849,7 @@
 <w:ftr xmlns:wpc="http://schemas.microsoft.com/office/word/2010/wordprocessingCanvas" xmlns:cx="http://schemas.microsoft.com/office/drawing/2014/chartex" xmlns:cx1="http://schemas.microsoft.com/office/drawing/2015/9/8/chartex" xmlns:cx2="http://schemas.microsoft.com/office/drawing/2015/10/21/chartex" xmlns:cx3="http://schemas.microsoft.com/office/drawing/2016/5/9/chartex" xmlns:cx4="http://schemas.microsoft.com/office/drawing/2016/5/10/chartex" xmlns:cx5="http://schemas.microsoft.com/office/drawing/2016/5/11/chartex" xmlns:cx6="http://schemas.microsoft.com/office/drawing/2016/5/12/chartex" xmlns:cx7="http://schemas.microsoft.com/office/drawing/2016/5/13/chartex" xmlns:cx8="http://schemas.microsoft.com/office/drawing/2016/5/14/chartex" xmlns:mc="http://schemas.openxmlformats.org/markup-compatibility/2006" xmlns:aink="http://schemas.microsoft.com/office/drawing/2016/ink" xmlns:am3d="http://schemas.microsoft.com/office/drawing/2017/model3d" xmlns:o="urn:schemas-microsoft-com:office:office" xmlns:oel="http://schemas.microsoft.com/office/2019/extlst" xmlns:r="http://schemas.openxmlformats.org/officeDocument/2006/relationships" xmlns:m="http://schemas.openxmlformats.org/officeDocument/2006/math" xmlns:v="urn:schemas-microsoft-com:vml" xmlns:wp14="http://schemas.microsoft.com/office/word/2010/wordprocessingDrawing" xmlns:wp="http://schemas.openxmlformats.org/drawingml/2006/wordprocessingDrawing" xmlns:w10="urn:schemas-microsoft-com:office:word" xmlns:w="http://schemas.openxmlformats.org/wordprocessingml/2006/main" xmlns:w14="http://schemas.microsoft.com/office/word/2010/wordml" xmlns:w15="http://schemas.microsoft.com/office/word/2012/wordml" xmlns:w16cex="http://schemas.microsoft.com/office/word/2018/wordml/cex" xmlns:w16cid="http://schemas.microsoft.com/office/word/2016/wordml/cid" xmlns:w16="http://schemas.microsoft.com/office/word/2018/wordml" xmlns:w16du="http://schemas.microsoft.com/office/word/2023/wordml/word16du" xmlns:w16sdtdh="http://schemas.microsoft.com/office/word/2020/wordml/sdtdatahash" xmlns:w16sdtfl="http://schemas.microsoft.com/office/word/2024/wordml/sdtformatlock" xmlns:w16se="http://schemas.microsoft.com/office/word/2015/wordml/symex" xmlns:wpg="http://schemas.microsoft.com/office/word/2010/wordprocessingGroup" xmlns:wpi="http://schemas.microsoft.com/office/word/2010/wordprocessingInk" xmlns:wne="http://schemas.microsoft.com/office/word/2006/wordml" xmlns:wps="http://schemas.microsoft.com/office/word/2010/wordprocessingShape" mc:Ignorable="w14 w15 w16se w16cid w16 w16cex w16sdtdh w16sdtfl w16du wp14">
   <w:p>
     <w:pPr>
-      <w:pStyle w:val="Piedepgina"/>
+      <w:pStyle w:val="Footer"/>
       <w:ind w:left="-993"/>
       <w:rPr>
         <w:rFonts w:ascii="Arial" w:hAnsi="Arial" w:cs="Arial"/>
@@ -2279,7 +2860,7 @@
   </w:p>
   <w:p>
     <w:pPr>
-      <w:pStyle w:val="Piedepgina"/>
+      <w:pStyle w:val="Footer"/>
       <w:ind w:left="-426"/>
     </w:pPr>
   </w:p>
@@ -2290,7 +2871,7 @@
 <w:ftr xmlns:wpc="http://schemas.microsoft.com/office/word/2010/wordprocessingCanvas" xmlns:cx="http://schemas.microsoft.com/office/drawing/2014/chartex" xmlns:cx1="http://schemas.microsoft.com/office/drawing/2015/9/8/chartex" xmlns:cx2="http://schemas.microsoft.com/office/drawing/2015/10/21/chartex" xmlns:cx3="http://schemas.microsoft.com/office/drawing/2016/5/9/chartex" xmlns:cx4="http://schemas.microsoft.com/office/drawing/2016/5/10/chartex" xmlns:cx5="http://schemas.microsoft.com/office/drawing/2016/5/11/chartex" xmlns:cx6="http://schemas.microsoft.com/office/drawing/2016/5/12/chartex" xmlns:cx7="http://schemas.microsoft.com/office/drawing/2016/5/13/chartex" xmlns:cx8="http://schemas.microsoft.com/office/drawing/2016/5/14/chartex" xmlns:mc="http://schemas.openxmlformats.org/markup-compatibility/2006" xmlns:aink="http://schemas.microsoft.com/office/drawing/2016/ink" xmlns:am3d="http://schemas.microsoft.com/office/drawing/2017/model3d" xmlns:o="urn:schemas-microsoft-com:office:office" xmlns:oel="http://schemas.microsoft.com/office/2019/extlst" xmlns:r="http://schemas.openxmlformats.org/officeDocument/2006/relationships" xmlns:m="http://schemas.openxmlformats.org/officeDocument/2006/math" xmlns:v="urn:schemas-microsoft-com:vml" xmlns:wp14="http://schemas.microsoft.com/office/word/2010/wordprocessingDrawing" xmlns:wp="http://schemas.openxmlformats.org/drawingml/2006/wordprocessingDrawing" xmlns:w10="urn:schemas-microsoft-com:office:word" xmlns:w="http://schemas.openxmlformats.org/wordprocessingml/2006/main" xmlns:w14="http://schemas.microsoft.com/office/word/2010/wordml" xmlns:w15="http://schemas.microsoft.com/office/word/2012/wordml" xmlns:w16cex="http://schemas.microsoft.com/office/word/2018/wordml/cex" xmlns:w16cid="http://schemas.microsoft.com/office/word/2016/wordml/cid" xmlns:w16="http://schemas.microsoft.com/office/word/2018/wordml" xmlns:w16du="http://schemas.microsoft.com/office/word/2023/wordml/word16du" xmlns:w16sdtdh="http://schemas.microsoft.com/office/word/2020/wordml/sdtdatahash" xmlns:w16sdtfl="http://schemas.microsoft.com/office/word/2024/wordml/sdtformatlock" xmlns:w16se="http://schemas.microsoft.com/office/word/2015/wordml/symex" xmlns:wpg="http://schemas.microsoft.com/office/word/2010/wordprocessingGroup" xmlns:wpi="http://schemas.microsoft.com/office/word/2010/wordprocessingInk" xmlns:wne="http://schemas.microsoft.com/office/word/2006/wordml" xmlns:wps="http://schemas.microsoft.com/office/word/2010/wordprocessingShape" mc:Ignorable="w14 w15 w16se w16cid w16 w16cex w16sdtdh w16sdtfl w16du wp14">
   <w:p>
     <w:pPr>
-      <w:pStyle w:val="Piedepgina"/>
+      <w:pStyle w:val="Footer"/>
       <w:ind w:left="-993"/>
       <w:rPr>
         <w:rFonts w:ascii="Arial" w:hAnsi="Arial" w:cs="Arial"/>
@@ -2344,7 +2925,7 @@
   </w:p>
   <w:p>
     <w:pPr>
-      <w:pStyle w:val="Piedepgina"/>
+      <w:pStyle w:val="Footer"/>
       <w:ind w:left="-426"/>
     </w:pPr>
   </w:p>
@@ -2380,7 +2961,7 @@
 <w:hdr xmlns:wpc="http://schemas.microsoft.com/office/word/2010/wordprocessingCanvas" xmlns:cx="http://schemas.microsoft.com/office/drawing/2014/chartex" xmlns:cx1="http://schemas.microsoft.com/office/drawing/2015/9/8/chartex" xmlns:cx2="http://schemas.microsoft.com/office/drawing/2015/10/21/chartex" xmlns:cx3="http://schemas.microsoft.com/office/drawing/2016/5/9/chartex" xmlns:cx4="http://schemas.microsoft.com/office/drawing/2016/5/10/chartex" xmlns:cx5="http://schemas.microsoft.com/office/drawing/2016/5/11/chartex" xmlns:cx6="http://schemas.microsoft.com/office/drawing/2016/5/12/chartex" xmlns:cx7="http://schemas.microsoft.com/office/drawing/2016/5/13/chartex" xmlns:cx8="http://schemas.microsoft.com/office/drawing/2016/5/14/chartex" xmlns:mc="http://schemas.openxmlformats.org/markup-compatibility/2006" xmlns:aink="http://schemas.microsoft.com/office/drawing/2016/ink" xmlns:am3d="http://schemas.microsoft.com/office/drawing/2017/model3d" xmlns:o="urn:schemas-microsoft-com:office:office" xmlns:oel="http://schemas.microsoft.com/office/2019/extlst" xmlns:r="http://schemas.openxmlformats.org/officeDocument/2006/relationships" xmlns:m="http://schemas.openxmlformats.org/officeDocument/2006/math" xmlns:v="urn:schemas-microsoft-com:vml" xmlns:wp14="http://schemas.microsoft.com/office/word/2010/wordprocessingDrawing" xmlns:wp="http://schemas.openxmlformats.org/drawingml/2006/wordprocessingDrawing" xmlns:w10="urn:schemas-microsoft-com:office:word" xmlns:w="http://schemas.openxmlformats.org/wordprocessingml/2006/main" xmlns:w14="http://schemas.microsoft.com/office/word/2010/wordml" xmlns:w15="http://schemas.microsoft.com/office/word/2012/wordml" xmlns:w16cex="http://schemas.microsoft.com/office/word/2018/wordml/cex" xmlns:w16cid="http://schemas.microsoft.com/office/word/2016/wordml/cid" xmlns:w16="http://schemas.microsoft.com/office/word/2018/wordml" xmlns:w16du="http://schemas.microsoft.com/office/word/2023/wordml/word16du" xmlns:w16sdtdh="http://schemas.microsoft.com/office/word/2020/wordml/sdtdatahash" xmlns:w16sdtfl="http://schemas.microsoft.com/office/word/2024/wordml/sdtformatlock" xmlns:w16se="http://schemas.microsoft.com/office/word/2015/wordml/symex" xmlns:wpg="http://schemas.microsoft.com/office/word/2010/wordprocessingGroup" xmlns:wpi="http://schemas.microsoft.com/office/word/2010/wordprocessingInk" xmlns:wne="http://schemas.microsoft.com/office/word/2006/wordml" xmlns:wps="http://schemas.microsoft.com/office/word/2010/wordprocessingShape" mc:Ignorable="w14 w15 w16se w16cid w16 w16cex w16sdtdh w16sdtfl w16du wp14">
   <w:p>
     <w:pPr>
-      <w:pStyle w:val="Encabezado"/>
+      <w:pStyle w:val="Header"/>
     </w:pPr>
     <w:r>
       <w:rPr>
@@ -2458,7 +3039,7 @@
 <w:hdr xmlns:wpc="http://schemas.microsoft.com/office/word/2010/wordprocessingCanvas" xmlns:cx="http://schemas.microsoft.com/office/drawing/2014/chartex" xmlns:cx1="http://schemas.microsoft.com/office/drawing/2015/9/8/chartex" xmlns:cx2="http://schemas.microsoft.com/office/drawing/2015/10/21/chartex" xmlns:cx3="http://schemas.microsoft.com/office/drawing/2016/5/9/chartex" xmlns:cx4="http://schemas.microsoft.com/office/drawing/2016/5/10/chartex" xmlns:cx5="http://schemas.microsoft.com/office/drawing/2016/5/11/chartex" xmlns:cx6="http://schemas.microsoft.com/office/drawing/2016/5/12/chartex" xmlns:cx7="http://schemas.microsoft.com/office/drawing/2016/5/13/chartex" xmlns:cx8="http://schemas.microsoft.com/office/drawing/2016/5/14/chartex" xmlns:mc="http://schemas.openxmlformats.org/markup-compatibility/2006" xmlns:aink="http://schemas.microsoft.com/office/drawing/2016/ink" xmlns:am3d="http://schemas.microsoft.com/office/drawing/2017/model3d" xmlns:o="urn:schemas-microsoft-com:office:office" xmlns:oel="http://schemas.microsoft.com/office/2019/extlst" xmlns:r="http://schemas.openxmlformats.org/officeDocument/2006/relationships" xmlns:m="http://schemas.openxmlformats.org/officeDocument/2006/math" xmlns:v="urn:schemas-microsoft-com:vml" xmlns:wp14="http://schemas.microsoft.com/office/word/2010/wordprocessingDrawing" xmlns:wp="http://schemas.openxmlformats.org/drawingml/2006/wordprocessingDrawing" xmlns:w10="urn:schemas-microsoft-com:office:word" xmlns:w="http://schemas.openxmlformats.org/wordprocessingml/2006/main" xmlns:w14="http://schemas.microsoft.com/office/word/2010/wordml" xmlns:w15="http://schemas.microsoft.com/office/word/2012/wordml" xmlns:w16cex="http://schemas.microsoft.com/office/word/2018/wordml/cex" xmlns:w16cid="http://schemas.microsoft.com/office/word/2016/wordml/cid" xmlns:w16="http://schemas.microsoft.com/office/word/2018/wordml" xmlns:w16du="http://schemas.microsoft.com/office/word/2023/wordml/word16du" xmlns:w16sdtdh="http://schemas.microsoft.com/office/word/2020/wordml/sdtdatahash" xmlns:w16sdtfl="http://schemas.microsoft.com/office/word/2024/wordml/sdtformatlock" xmlns:w16se="http://schemas.microsoft.com/office/word/2015/wordml/symex" xmlns:wpg="http://schemas.microsoft.com/office/word/2010/wordprocessingGroup" xmlns:wpi="http://schemas.microsoft.com/office/word/2010/wordprocessingInk" xmlns:wne="http://schemas.microsoft.com/office/word/2006/wordml" xmlns:wps="http://schemas.microsoft.com/office/word/2010/wordprocessingShape" mc:Ignorable="w14 w15 w16se w16cid w16 w16cex w16sdtdh w16sdtfl w16du wp14">
   <w:p>
     <w:pPr>
-      <w:pStyle w:val="Encabezado"/>
+      <w:pStyle w:val="Header"/>
       <w:jc w:val="right"/>
     </w:pPr>
     <w:r>
@@ -3609,11 +4190,11 @@
       <w:rFonts w:ascii="Trebuchet MS" w:hAnsi="Trebuchet MS"/>
     </w:rPr>
   </w:style>
-  <w:style w:type="paragraph" w:styleId="Ttulo8">
+  <w:style w:type="paragraph" w:styleId="Heading8">
     <w:name w:val="heading 8"/>
     <w:basedOn w:val="Normal"/>
     <w:next w:val="Normal"/>
-    <w:link w:val="Ttulo8Car"/>
+    <w:link w:val="Heading8Char"/>
     <w:qFormat/>
     <w:rsid w:val="00003C36"/>
     <w:pPr>
@@ -3631,13 +4212,13 @@
       <w:lang w:eastAsia="es-ES"/>
     </w:rPr>
   </w:style>
-  <w:style w:type="character" w:default="1" w:styleId="Fuentedeprrafopredeter">
+  <w:style w:type="character" w:default="1" w:styleId="DefaultParagraphFont">
     <w:name w:val="Default Paragraph Font"/>
     <w:uiPriority w:val="1"/>
     <w:semiHidden/>
     <w:unhideWhenUsed/>
   </w:style>
-  <w:style w:type="table" w:default="1" w:styleId="Tablanormal">
+  <w:style w:type="table" w:default="1" w:styleId="TableNormal">
     <w:name w:val="Normal Table"/>
     <w:uiPriority w:val="99"/>
     <w:semiHidden/>
@@ -3652,7 +4233,7 @@
       </w:tblCellMar>
     </w:tblPr>
   </w:style>
-  <w:style w:type="numbering" w:default="1" w:styleId="Sinlista">
+  <w:style w:type="numbering" w:default="1" w:styleId="NoList">
     <w:name w:val="No List"/>
     <w:uiPriority w:val="99"/>
     <w:semiHidden/>
@@ -3674,10 +4255,10 @@
       <w:lang w:eastAsia="es-ES"/>
     </w:rPr>
   </w:style>
-  <w:style w:type="paragraph" w:styleId="Encabezado">
+  <w:style w:type="paragraph" w:styleId="Header">
     <w:name w:val="header"/>
     <w:basedOn w:val="Normal"/>
-    <w:link w:val="EncabezadoCar"/>
+    <w:link w:val="HeaderChar"/>
     <w:uiPriority w:val="99"/>
     <w:unhideWhenUsed/>
     <w:rsid w:val="0042546A"/>
@@ -3689,20 +4270,20 @@
       <w:spacing w:after="0" w:line="240" w:lineRule="auto"/>
     </w:pPr>
   </w:style>
-  <w:style w:type="character" w:customStyle="1" w:styleId="EncabezadoCar">
-    <w:name w:val="Encabezado Car"/>
-    <w:basedOn w:val="Fuentedeprrafopredeter"/>
-    <w:link w:val="Encabezado"/>
+  <w:style w:type="character" w:customStyle="1" w:styleId="HeaderChar">
+    <w:name w:val="Header Char"/>
+    <w:basedOn w:val="DefaultParagraphFont"/>
+    <w:link w:val="Header"/>
     <w:uiPriority w:val="99"/>
     <w:rsid w:val="0042546A"/>
     <w:rPr>
       <w:rFonts w:ascii="Trebuchet MS" w:hAnsi="Trebuchet MS"/>
     </w:rPr>
   </w:style>
-  <w:style w:type="paragraph" w:styleId="Piedepgina">
+  <w:style w:type="paragraph" w:styleId="Footer">
     <w:name w:val="footer"/>
     <w:basedOn w:val="Normal"/>
-    <w:link w:val="PiedepginaCar"/>
+    <w:link w:val="FooterChar"/>
     <w:uiPriority w:val="99"/>
     <w:unhideWhenUsed/>
     <w:rsid w:val="0042546A"/>
@@ -3714,17 +4295,17 @@
       <w:spacing w:after="0" w:line="240" w:lineRule="auto"/>
     </w:pPr>
   </w:style>
-  <w:style w:type="character" w:customStyle="1" w:styleId="PiedepginaCar">
-    <w:name w:val="Pie de página Car"/>
-    <w:basedOn w:val="Fuentedeprrafopredeter"/>
-    <w:link w:val="Piedepgina"/>
+  <w:style w:type="character" w:customStyle="1" w:styleId="FooterChar">
+    <w:name w:val="Footer Char"/>
+    <w:basedOn w:val="DefaultParagraphFont"/>
+    <w:link w:val="Footer"/>
     <w:uiPriority w:val="99"/>
     <w:rsid w:val="0042546A"/>
     <w:rPr>
       <w:rFonts w:ascii="Trebuchet MS" w:hAnsi="Trebuchet MS"/>
     </w:rPr>
   </w:style>
-  <w:style w:type="paragraph" w:styleId="Prrafodelista">
+  <w:style w:type="paragraph" w:styleId="ListParagraph">
     <w:name w:val="List Paragraph"/>
     <w:basedOn w:val="Normal"/>
     <w:uiPriority w:val="34"/>
@@ -3735,10 +4316,10 @@
       <w:contextualSpacing/>
     </w:pPr>
   </w:style>
-  <w:style w:type="character" w:customStyle="1" w:styleId="Ttulo8Car">
-    <w:name w:val="Título 8 Car"/>
-    <w:basedOn w:val="Fuentedeprrafopredeter"/>
-    <w:link w:val="Ttulo8"/>
+  <w:style w:type="character" w:customStyle="1" w:styleId="Heading8Char">
+    <w:name w:val="Heading 8 Char"/>
+    <w:basedOn w:val="DefaultParagraphFont"/>
+    <w:link w:val="Heading8"/>
     <w:rsid w:val="00003C36"/>
     <w:rPr>
       <w:rFonts w:ascii="Arial" w:eastAsia="Calibri" w:hAnsi="Arial" w:cs="Arial"/>
@@ -4049,23 +4630,6 @@
 </file>
 
 <file path=customXml/item1.xml><?xml version="1.0" encoding="utf-8"?>
-<p:properties xmlns:p="http://schemas.microsoft.com/office/2006/metadata/properties" xmlns:xsi="http://www.w3.org/2001/XMLSchema-instance" xmlns:pc="http://schemas.microsoft.com/office/infopath/2007/PartnerControls">
-  <documentManagement>
-    <_activity xmlns="b46a89ea-6f85-4574-ac72-0721a8647d7b" xsi:nil="true"/>
-  </documentManagement>
-</p:properties>
-</file>
-
-<file path=customXml/item2.xml><?xml version="1.0" encoding="utf-8"?>
-<?mso-contentType ?>
-<FormTemplates xmlns="http://schemas.microsoft.com/sharepoint/v3/contenttype/forms">
-  <Display>DocumentLibraryForm</Display>
-  <Edit>DocumentLibraryForm</Edit>
-  <New>DocumentLibraryForm</New>
-</FormTemplates>
-</file>
-
-<file path=customXml/item3.xml><?xml version="1.0" encoding="utf-8"?>
 <ct:contentTypeSchema xmlns:ct="http://schemas.microsoft.com/office/2006/metadata/contentType" xmlns:ma="http://schemas.microsoft.com/office/2006/metadata/properties/metaAttributes" ct:_="" ma:_="" ma:contentTypeName="Document" ma:contentTypeID="0x01010088132AB15DCEEF45BD8147C62AF74F53" ma:contentTypeVersion="12" ma:contentTypeDescription="Create a new document." ma:contentTypeScope="" ma:versionID="caca7c3c859a3186d3eb4a824c172f31">
   <xsd:schema xmlns:xsd="http://www.w3.org/2001/XMLSchema" xmlns:xs="http://www.w3.org/2001/XMLSchema" xmlns:p="http://schemas.microsoft.com/office/2006/metadata/properties" xmlns:ns3="b46a89ea-6f85-4574-ac72-0721a8647d7b" xmlns:ns4="2694d06e-2c3f-4b97-8326-e8914ede2085" targetNamespace="http://schemas.microsoft.com/office/2006/metadata/properties" ma:root="true" ma:fieldsID="70641d664a5a93bd0daa9271f7dfb8bf" ns3:_="" ns4:_="">
     <xsd:import namespace="b46a89ea-6f85-4574-ac72-0721a8647d7b"/>
@@ -4280,25 +4844,24 @@
 </ct:contentTypeSchema>
 </file>
 
-<file path=customXml/itemProps1.xml><?xml version="1.0" encoding="utf-8"?>
-<ds:datastoreItem xmlns:ds="http://schemas.openxmlformats.org/officeDocument/2006/customXml" ds:itemID="{060A51E5-C2AC-4E32-914C-EF533BF5042F}">
-  <ds:schemaRefs>
-    <ds:schemaRef ds:uri="http://schemas.microsoft.com/office/2006/metadata/properties"/>
-    <ds:schemaRef ds:uri="http://schemas.microsoft.com/office/infopath/2007/PartnerControls"/>
-    <ds:schemaRef ds:uri="b46a89ea-6f85-4574-ac72-0721a8647d7b"/>
-  </ds:schemaRefs>
-</ds:datastoreItem>
+<file path=customXml/item2.xml><?xml version="1.0" encoding="utf-8"?>
+<?mso-contentType ?>
+<FormTemplates xmlns="http://schemas.microsoft.com/sharepoint/v3/contenttype/forms">
+  <Display>DocumentLibraryForm</Display>
+  <Edit>DocumentLibraryForm</Edit>
+  <New>DocumentLibraryForm</New>
+</FormTemplates>
 </file>
 
-<file path=customXml/itemProps2.xml><?xml version="1.0" encoding="utf-8"?>
-<ds:datastoreItem xmlns:ds="http://schemas.openxmlformats.org/officeDocument/2006/customXml" ds:itemID="{B247901F-F223-43BA-AC59-193564DAD1B1}">
-  <ds:schemaRefs>
-    <ds:schemaRef ds:uri="http://schemas.microsoft.com/sharepoint/v3/contenttype/forms"/>
-  </ds:schemaRefs>
-</ds:datastoreItem>
+<file path=customXml/item3.xml><?xml version="1.0" encoding="utf-8"?>
+<p:properties xmlns:p="http://schemas.microsoft.com/office/2006/metadata/properties" xmlns:xsi="http://www.w3.org/2001/XMLSchema-instance" xmlns:pc="http://schemas.microsoft.com/office/infopath/2007/PartnerControls">
+  <documentManagement>
+    <_activity xmlns="b46a89ea-6f85-4574-ac72-0721a8647d7b" xsi:nil="true"/>
+  </documentManagement>
+</p:properties>
 </file>
 
-<file path=customXml/itemProps3.xml><?xml version="1.0" encoding="utf-8"?>
+<file path=customXml/itemProps1.xml><?xml version="1.0" encoding="utf-8"?>
 <ds:datastoreItem xmlns:ds="http://schemas.openxmlformats.org/officeDocument/2006/customXml" ds:itemID="{65B00878-8311-4019-B334-C004302C0B8C}">
   <ds:schemaRefs>
     <ds:schemaRef ds:uri="http://schemas.microsoft.com/office/2006/metadata/contentType"/>
@@ -4315,4 +4878,22 @@
     <ds:schemaRef ds:uri="http://schemas.microsoft.com/internal/obd"/>
   </ds:schemaRefs>
 </ds:datastoreItem>
+</file>
+
+<file path=customXml/itemProps2.xml><?xml version="1.0" encoding="utf-8"?>
+<ds:datastoreItem xmlns:ds="http://schemas.openxmlformats.org/officeDocument/2006/customXml" ds:itemID="{B247901F-F223-43BA-AC59-193564DAD1B1}">
+  <ds:schemaRefs>
+    <ds:schemaRef ds:uri="http://schemas.microsoft.com/sharepoint/v3/contenttype/forms"/>
+  </ds:schemaRefs>
+</ds:datastoreItem>
+</file>
+
+<file path=customXml/itemProps3.xml><?xml version="1.0" encoding="utf-8"?>
+<ds:datastoreItem xmlns:ds="http://schemas.openxmlformats.org/officeDocument/2006/customXml" ds:itemID="{060A51E5-C2AC-4E32-914C-EF533BF5042F}">
+  <ds:schemaRefs>
+    <ds:schemaRef ds:uri="http://schemas.microsoft.com/office/2006/metadata/properties"/>
+    <ds:schemaRef ds:uri="http://schemas.microsoft.com/office/infopath/2007/PartnerControls"/>
+    <ds:schemaRef ds:uri="b46a89ea-6f85-4574-ac72-0721a8647d7b"/>
+  </ds:schemaRefs>
+</ds:datastoreItem>
 </file>
</xml_diff>